<commit_message>
Fix extra whitespace in JP Czechoslovakia and Yugoslavia text strings
Co-Authored-By: Tatsuki Onishi <bougtoir@gmail.com>
</commit_message>
<xml_diff>
--- a/tempo-effect-paper/manuscripts/PDR_Research_Note_JP.docx
+++ b/tempo-effect-paper/manuscripts/PDR_Research_Note_JP.docx
@@ -2749,7 +2749,7 @@
           <w:i w:val="0"/>
           <w:sz w:val="22"/>
         </w:rPr>
-        <w:t>1993年1月1日のチェコスロバキアの平和的解体はチェコとスロバキアの2つの独立国家を生んだ。国境を越える移民は比較的限定的であり、最小限の人口再配分を伴う国家分割という比較的クリーンな自然実験を構成する。本モデルは1970-2023年の全期間で    チェコのMAPE 6.3%、スロバキアのMAPE 9.9%を達成する。スロバキアのより大きな誤差はEU加盟（2004年）後のチェコおよび西欧への移民流出を反映しており、閉鎖モデルはこれを捕捉できない。</w:t>
+        <w:t>1993年1月1日のチェコスロバキアの平和的解体はチェコとスロバキアの2つの独立国家を生んだ。国境を越える移民は比較的限定的であり、最小限の人口再配分を伴う国家分割という比較的クリーンな自然実験を構成する。本モデルは1970-2023年の全期間でチェコのMAPE 6.3%、スロバキアのMAPE 9.9%を達成する。スロバキアのより大きな誤差はEU加盟（2004年）後のチェコおよび西欧への移民流出を反映しており、閉鎖モデルはこれを捕捉できない。</w:t>
       </w:r>
     </w:p>
     <w:p>
@@ -2773,7 +2773,7 @@
           <w:i w:val="0"/>
           <w:sz w:val="22"/>
         </w:rPr>
-        <w:t>ユーゴスラビアの解体は武力紛争、民族浄化、大規模な難民流出を伴い、全ての後継国家に影響を及ぼした。これは本サンプルにおける最も極端な移民ショックを表す。モデル性能は後継国間で大きく異なる：クロアチア（MAPE 4.1%）と北マケドニア（6.4%）は合理的な適合度を示し、比較的安定した紛争後の人口動態を反映する。ボスニア・ヘルツェゴビナ（8.1%）とスロベニア（12.2%）はより大きな誤差を示す——ボスニアは戦争関連の人口損失と避難、スロベニアは小規模なEU加盟国としての移民流入による成長が原因。    セルビア（7.1%）とモンテネグロ（8.1%）はその中間に位置する。</w:t>
+        <w:t>ユーゴスラビアの解体は武力紛争、民族浄化、大規模な難民流出を伴い、全ての後継国家に影響を及ぼした。これは本サンプルにおける最も極端な移民ショックを表す。モデル性能は後継国間で大きく異なる：クロアチア（MAPE 4.1%）と北マケドニア（6.4%）は合理的な適合度を示し、比較的安定した紛争後の人口動態を反映する。ボスニア・ヘルツェゴビナ（8.1%）とスロベニア（12.2%）はより大きな誤差を示す——ボスニアは戦争関連の人口損失と避難、スロベニアは小規模なEU加盟国としての移民流入による成長が原因。セルビア（7.1%）とモンテネグロ（8.1%）はその中間に位置する。</w:t>
       </w:r>
     </w:p>
     <w:p>

</xml_diff>